<commit_message>
Guides Word (finance, direction, exploitation) et guide intégré régénérés
Co-Authored-By: Claude Opus 5.5 <noreply@anthropic.com>
</commit_message>
<xml_diff>
--- a/docs/guides/word/Guide_direction.docx
+++ b/docs/guides/word/Guide_direction.docx
@@ -11,7 +11,7 @@
           <wp:inline distT="0" distB="0" distL="0" distR="0">
             <wp:extent cx="1428750" cy="476250"/>
             <wp:effectExtent t="0" r="0" b="0" l="0"/>
-            <wp:docPr id="3" name="" descr="" title=""/>
+            <wp:docPr id="4" name="" descr="" title=""/>
             <wp:cNvGraphicFramePr>
               <a:graphicFrameLocks xmlns:a="http://schemas.openxmlformats.org/drawingml/2006/main" noChangeAspect="1"/>
             </wp:cNvGraphicFramePr>
@@ -287,7 +287,7 @@
           <w:sz w:val="20"/>
           <w:szCs w:val="20"/>
         </w:rPr>
-        <w:t xml:space="preserve">Chiffre d'affaires du mois et de l'exercice, résultat net, excédent brut d'exploitation.</w:t>
+        <w:t xml:space="preserve">« Arrêté au » : le tableau de bord se recalcule à la date choisie (aujourd'hui par défaut).</w:t>
       </w:r>
     </w:p>
     <w:p>
@@ -316,7 +316,7 @@
           <w:sz w:val="20"/>
           <w:szCs w:val="20"/>
         </w:rPr>
-        <w:t xml:space="preserve">Trésorerie par compte bancaire et caisse, encours clients et fournisseurs par ancienneté.</w:t>
+        <w:t xml:space="preserve">Chiffre d'affaires du mois et de l'exercice face au budget, excédent brut d'exploitation et marge d'EBE, résultat net et marge nette, résultat après dépréciation des créances (IFRS 9).</w:t>
       </w:r>
     </w:p>
     <w:p>
@@ -345,7 +345,7 @@
           <w:sz w:val="20"/>
           <w:szCs w:val="20"/>
         </w:rPr>
-        <w:t xml:space="preserve">Dette : capital restant dû, prochaine échéance, ratio de couverture du service de la dette (DSCR).</w:t>
+        <w:t xml:space="preserve">Délai de recouvrement (DSO) face à la cible, couverture de la dette (DSCR) face au minimum fixé, besoin en fonds de roulement (DSO, DPO, cycle, part échue, concentration sur le premier client).</w:t>
       </w:r>
     </w:p>
     <w:p>
@@ -374,7 +374,7 @@
           <w:sz w:val="20"/>
           <w:szCs w:val="20"/>
         </w:rPr>
-        <w:t xml:space="preserve">Évolution mensuelle du chiffre d'affaires et du résultat ; marge par activité.</w:t>
+        <w:t xml:space="preserve">Trésorerie par compte, trésorerie de fin de mois avec le seuil de sécurité et le point bas, trésorerie prévue en fin de mois (créances à encaisser, fournisseurs et échéances d'emprunt à payer), réalisé contre budget cumulé, dette nette et gearing.</w:t>
       </w:r>
     </w:p>
     <w:p>
@@ -403,7 +403,7 @@
           <w:sz w:val="20"/>
           <w:szCs w:val="20"/>
         </w:rPr>
-        <w:t xml:space="preserve">Alertes actives (seuils fixés avec la direction : trésorerie, marge transport, retards d'approbation, compte de passage non soldé, clôture en retard…).</w:t>
+        <w:t xml:space="preserve">Les onze questions du dirigeant (gagnons-nous de l'argent, ai-je de quoi payer le mois prochain, à quelle vitesse suis-je payé, puis-je honorer mes échéances bancaires, quels camions me coûtent de l'argent, mes comptes sont-ils diffusables…), chacune avec sa réponse, son verdict et sa lecture.</w:t>
       </w:r>
     </w:p>
     <w:p>
@@ -432,7 +432,36 @@
           <w:sz w:val="20"/>
           <w:szCs w:val="20"/>
         </w:rPr>
-        <w:t xml:space="preserve">Le bouton « Société / Groupe » passe de la société de travail à la vue consolidée du groupe.</w:t>
+        <w:t xml:space="preserve">« Ce qui demande une décision » : les six alertes les plus graves, avec l'action recommandée.</w:t>
+      </w:r>
+    </w:p>
+    <w:p>
+      <w:pPr>
+        <w:tabs>
+          <w:tab w:val="left" w:pos="360"/>
+        </w:tabs>
+        <w:spacing w:after="60"/>
+        <w:ind w:left="360" w:hanging="360"/>
+        <w:jc w:val="both"/>
+      </w:pPr>
+      <w:r>
+        <w:rPr>
+          <w:rFonts w:ascii="Calibri" w:cs="Calibri" w:eastAsia="Calibri" w:hAnsi="Calibri"/>
+          <w:b/>
+          <w:bCs/>
+          <w:color w:val="1A9E9E"/>
+          <w:sz w:val="20"/>
+          <w:szCs w:val="20"/>
+        </w:rPr>
+        <w:t xml:space="preserve">•	</w:t>
+      </w:r>
+      <w:r>
+        <w:rPr>
+          <w:rFonts w:ascii="Calibri" w:cs="Calibri" w:eastAsia="Calibri" w:hAnsi="Calibri"/>
+          <w:sz w:val="20"/>
+          <w:szCs w:val="20"/>
+        </w:rPr>
+        <w:t xml:space="preserve">Le bouton « Société / Groupe » passe de la société de travail à la vue consolidée du groupe ; « Imprimer » produit un tableau de bord diffusable.</w:t>
       </w:r>
     </w:p>
     <w:p>
@@ -452,6 +481,40 @@
           <w:sz w:val="26"/>
           <w:szCs w:val="26"/>
         </w:rPr>
+        <w:t xml:space="preserve">Alertes de gestion (Pilotage &gt; Alertes)</w:t>
+      </w:r>
+    </w:p>
+    <w:p>
+      <w:pPr>
+        <w:spacing w:after="100"/>
+        <w:jc w:val="both"/>
+      </w:pPr>
+      <w:r>
+        <w:rPr>
+          <w:rFonts w:ascii="Calibri" w:cs="Calibri" w:eastAsia="Calibri" w:hAnsi="Calibri"/>
+          <w:sz w:val="20"/>
+          <w:szCs w:val="20"/>
+        </w:rPr>
+        <w:t xml:space="preserve">Chaque règle compare une valeur constatée à un seuil fixé avec la direction (Administration &gt; Seuils et taux) : trésorerie minimale, DSCR minimal, délai de recouvrement cible, part échue des créances, concentration sur un client, dettes fournisseurs échues, marge transport, dépassement budgétaire… Gravités : bloquante (interdit la clôture), critique, élevée, moyenne. « Toutes les règles » affiche aussi les règles conformes. Un seuil laissé à 0 éteint sa règle : la règle « Seuils à renseigner » le signale. Les pastilles de la navigation comptent les alertes, les validations en attente et les contrôles en anomalie ; l'en-tête indique si le total des débits de l'exercice égale celui des crédits.</w:t>
+      </w:r>
+    </w:p>
+    <w:p>
+      <w:pPr>
+        <w:keepNext/>
+        <w:pBdr>
+          <w:bottom w:val="single" w:color="1A9E9E" w:sz="6" w:space="2"/>
+        </w:pBdr>
+        <w:spacing w:after="100" w:before="280"/>
+      </w:pPr>
+      <w:r>
+        <w:rPr>
+          <w:rFonts w:ascii="Calibri" w:cs="Calibri" w:eastAsia="Calibri" w:hAnsi="Calibri"/>
+          <w:b/>
+          <w:bCs/>
+          <w:color w:val="1C1E6B"/>
+          <w:sz w:val="26"/>
+          <w:szCs w:val="26"/>
+        </w:rPr>
         <w:t xml:space="preserve">Rapport mensuel de gestion (Pilotage &gt; Rapport mensuel)</w:t>
       </w:r>
     </w:p>
@@ -466,7 +529,7 @@
           <w:sz w:val="20"/>
           <w:szCs w:val="20"/>
         </w:rPr>
-        <w:t xml:space="preserve">Choisir le mois, puis « Imprimer » pour obtenir le rapport à diffuser : indicateurs, résultat du mois et cumulé comparés à l'an dernier, activités, flux de trésorerie, trésorerie par compte, transport par ensemble routier, alertes.</w:t>
+        <w:t xml:space="preserve">Choisir le mois, puis « Imprimer » pour obtenir le rapport à diffuser : indicateurs, lecture de la période rédigée par la plateforme (le mois comparé au mois précédent et à l'an dernier), résultat du mois et cumulé, trésorerie et financement (encaissements, décaissements, cash net, service de la dette), clients et fournisseurs (DSO, dettes échues, BFR), transport (rotations, marge, camions déficitaires, rotations non facturées), flux mensuels de trésorerie, alertes avec leurs actions.</w:t>
       </w:r>
     </w:p>
     <w:p>

</xml_diff>